<commit_message>
Se mejora escript de validación, ahora separa las acciones validadas de las que no, se actualiza el cliente MCP para que llame a las acciones ya validadas y lsa presente como reporte. Se mejoran descripciones en las signatures. Se explora la posibildiad de compartir imágenes mediante el servidor.
</commit_message>
<xml_diff>
--- a/Avances_Proyecto/Pruebas/Sistema_entrada/Prueba de signature Planeador.docx
+++ b/Avances_Proyecto/Pruebas/Sistema_entrada/Prueba de signature Planeador.docx
@@ -909,6 +909,290 @@
           <w:bCs/>
           <w:lang w:val="en-US"/>
         </w:rPr>
+        <w:t xml:space="preserve">: dict = </w:t>
+      </w:r>
+      <w:proofErr w:type="spellStart"/>
+      <w:proofErr w:type="gramStart"/>
+      <w:r>
+        <w:rPr>
+          <w:b/>
+          <w:bCs/>
+          <w:lang w:val="en-US"/>
+        </w:rPr>
+        <w:t>dspy.InputField</w:t>
+      </w:r>
+      <w:proofErr w:type="spellEnd"/>
+      <w:proofErr w:type="gramEnd"/>
+      <w:r>
+        <w:rPr>
+          <w:b/>
+          <w:bCs/>
+          <w:lang w:val="en-US"/>
+        </w:rPr>
+        <w:t>(</w:t>
+      </w:r>
+    </w:p>
+    <w:p>
+      <w:pPr>
+        <w:rPr>
+          <w:b/>
+          <w:bCs/>
+        </w:rPr>
+      </w:pPr>
+      <w:r>
+        <w:rPr>
+          <w:b/>
+          <w:bCs/>
+          <w:lang w:val="en-US"/>
+        </w:rPr>
+        <w:t xml:space="preserve">        </w:t>
+      </w:r>
+      <w:proofErr w:type="spellStart"/>
+      <w:r>
+        <w:rPr>
+          <w:b/>
+          <w:bCs/>
+        </w:rPr>
+        <w:t>desc</w:t>
+      </w:r>
+      <w:proofErr w:type="spellEnd"/>
+      <w:proofErr w:type="gramStart"/>
+      <w:r>
+        <w:rPr>
+          <w:b/>
+          <w:bCs/>
+        </w:rPr>
+        <w:t>=(</w:t>
+      </w:r>
+      <w:proofErr w:type="gramEnd"/>
+    </w:p>
+    <w:p>
+      <w:pPr>
+        <w:rPr>
+          <w:b/>
+          <w:bCs/>
+        </w:rPr>
+      </w:pPr>
+      <w:r>
+        <w:rPr>
+          <w:b/>
+          <w:bCs/>
+        </w:rPr>
+        <w:t>            "Resumen estructurado de las herramientas disponibles en el sistema, organizado por servidores. "</w:t>
+      </w:r>
+    </w:p>
+    <w:p>
+      <w:pPr>
+        <w:rPr>
+          <w:b/>
+          <w:bCs/>
+        </w:rPr>
+      </w:pPr>
+      <w:r>
+        <w:rPr>
+          <w:b/>
+          <w:bCs/>
+        </w:rPr>
+        <w:t>            "Incluye, para cada herramienta, su propósito, criterios de uso, esquema de entradas (</w:t>
+      </w:r>
+      <w:proofErr w:type="spellStart"/>
+      <w:r>
+        <w:rPr>
+          <w:b/>
+          <w:bCs/>
+        </w:rPr>
+        <w:t>input_schema</w:t>
+      </w:r>
+      <w:proofErr w:type="spellEnd"/>
+      <w:r>
+        <w:rPr>
+          <w:b/>
+          <w:bCs/>
+        </w:rPr>
+        <w:t>) "</w:t>
+      </w:r>
+    </w:p>
+    <w:p>
+      <w:pPr>
+        <w:rPr>
+          <w:b/>
+          <w:bCs/>
+        </w:rPr>
+      </w:pPr>
+      <w:r>
+        <w:rPr>
+          <w:b/>
+          <w:bCs/>
+        </w:rPr>
+        <w:t>            "y esquema de salidas (</w:t>
+      </w:r>
+      <w:proofErr w:type="spellStart"/>
+      <w:r>
+        <w:rPr>
+          <w:b/>
+          <w:bCs/>
+        </w:rPr>
+        <w:t>output_schema</w:t>
+      </w:r>
+      <w:proofErr w:type="spellEnd"/>
+      <w:r>
+        <w:rPr>
+          <w:b/>
+          <w:bCs/>
+        </w:rPr>
+        <w:t>). Esta información debe ser utilizada por el planeador para:\n"</w:t>
+      </w:r>
+    </w:p>
+    <w:p>
+      <w:pPr>
+        <w:rPr>
+          <w:b/>
+          <w:bCs/>
+        </w:rPr>
+      </w:pPr>
+      <w:r>
+        <w:rPr>
+          <w:b/>
+          <w:bCs/>
+        </w:rPr>
+        <w:t xml:space="preserve">            "- determinar qué herramientas son funcionalmente adecuadas para cada </w:t>
+      </w:r>
+      <w:proofErr w:type="gramStart"/>
+      <w:r>
+        <w:rPr>
+          <w:b/>
+          <w:bCs/>
+        </w:rPr>
+        <w:t>solicitud,\</w:t>
+      </w:r>
+      <w:proofErr w:type="gramEnd"/>
+      <w:r>
+        <w:rPr>
+          <w:b/>
+          <w:bCs/>
+        </w:rPr>
+        <w:t>n"</w:t>
+      </w:r>
+    </w:p>
+    <w:p>
+      <w:pPr>
+        <w:rPr>
+          <w:b/>
+          <w:bCs/>
+        </w:rPr>
+      </w:pPr>
+      <w:r>
+        <w:rPr>
+          <w:b/>
+          <w:bCs/>
+        </w:rPr>
+        <w:t xml:space="preserve">            "- construir cadenas de acciones donde la salida de una herramienta pueda servir como entrada de </w:t>
+      </w:r>
+      <w:proofErr w:type="gramStart"/>
+      <w:r>
+        <w:rPr>
+          <w:b/>
+          <w:bCs/>
+        </w:rPr>
+        <w:t>otra,\</w:t>
+      </w:r>
+      <w:proofErr w:type="gramEnd"/>
+      <w:r>
+        <w:rPr>
+          <w:b/>
+          <w:bCs/>
+        </w:rPr>
+        <w:t>n"</w:t>
+      </w:r>
+    </w:p>
+    <w:p>
+      <w:pPr>
+        <w:rPr>
+          <w:b/>
+          <w:bCs/>
+        </w:rPr>
+      </w:pPr>
+      <w:r>
+        <w:rPr>
+          <w:b/>
+          <w:bCs/>
+        </w:rPr>
+        <w:t>            "- y evaluar la viabilidad de un plan antes de su ejecución."</w:t>
+      </w:r>
+    </w:p>
+    <w:p>
+      <w:pPr>
+        <w:rPr>
+          <w:b/>
+          <w:bCs/>
+          <w:lang w:val="en-US"/>
+        </w:rPr>
+      </w:pPr>
+      <w:r>
+        <w:rPr>
+          <w:b/>
+          <w:bCs/>
+        </w:rPr>
+        <w:t xml:space="preserve">        </w:t>
+      </w:r>
+      <w:r>
+        <w:rPr>
+          <w:b/>
+          <w:bCs/>
+          <w:lang w:val="en-US"/>
+        </w:rPr>
+        <w:t>)</w:t>
+      </w:r>
+    </w:p>
+    <w:p>
+      <w:pPr>
+        <w:rPr>
+          <w:b/>
+          <w:bCs/>
+          <w:lang w:val="en-US"/>
+        </w:rPr>
+      </w:pPr>
+      <w:r>
+        <w:rPr>
+          <w:b/>
+          <w:bCs/>
+          <w:lang w:val="en-US"/>
+        </w:rPr>
+        <w:t>    )</w:t>
+      </w:r>
+    </w:p>
+    <w:p>
+      <w:pPr>
+        <w:rPr>
+          <w:b/>
+          <w:bCs/>
+          <w:lang w:val="en-US"/>
+        </w:rPr>
+      </w:pPr>
+      <w:r>
+        <w:rPr>
+          <w:b/>
+          <w:bCs/>
+          <w:lang w:val="en-US"/>
+        </w:rPr>
+        <w:t xml:space="preserve">    </w:t>
+      </w:r>
+      <w:proofErr w:type="spellStart"/>
+      <w:r>
+        <w:rPr>
+          <w:b/>
+          <w:bCs/>
+          <w:lang w:val="en-US"/>
+        </w:rPr>
+        <w:t>temporal_context</w:t>
+      </w:r>
+      <w:proofErr w:type="spellEnd"/>
+      <w:r>
+        <w:rPr>
+          <w:b/>
+          <w:bCs/>
+          <w:lang w:val="en-US"/>
+        </w:rPr>
         <w:t xml:space="preserve">: </w:t>
       </w:r>
       <w:proofErr w:type="spellStart"/>
@@ -963,7 +1247,7 @@
           <w:bCs/>
           <w:lang w:val="en-US"/>
         </w:rPr>
-        <w:t xml:space="preserve">        </w:t>
+        <w:t xml:space="preserve">    </w:t>
       </w:r>
       <w:proofErr w:type="spellStart"/>
       <w:r>
@@ -996,146 +1280,52 @@
           <w:b/>
           <w:bCs/>
         </w:rPr>
-        <w:t>            "Resumen estructurado de las herramientas disponibles en el sistema, organizado por servidores. "</w:t>
-      </w:r>
-    </w:p>
-    <w:p>
-      <w:pPr>
-        <w:rPr>
-          <w:b/>
-          <w:bCs/>
-        </w:rPr>
-      </w:pPr>
-      <w:r>
-        <w:rPr>
-          <w:b/>
-          <w:bCs/>
-        </w:rPr>
-        <w:t>            "Incluye, para cada herramienta, su propósito, criterios de uso, esquema de entradas (</w:t>
-      </w:r>
-      <w:proofErr w:type="spellStart"/>
-      <w:r>
-        <w:rPr>
-          <w:b/>
-          <w:bCs/>
-        </w:rPr>
-        <w:t>input_schema</w:t>
-      </w:r>
-      <w:proofErr w:type="spellEnd"/>
-      <w:r>
-        <w:rPr>
-          <w:b/>
-          <w:bCs/>
-        </w:rPr>
-        <w:t>) "</w:t>
-      </w:r>
-    </w:p>
-    <w:p>
-      <w:pPr>
-        <w:rPr>
-          <w:b/>
-          <w:bCs/>
-        </w:rPr>
-      </w:pPr>
-      <w:r>
-        <w:rPr>
-          <w:b/>
-          <w:bCs/>
-        </w:rPr>
-        <w:t>            "y esquema de salidas (</w:t>
-      </w:r>
-      <w:proofErr w:type="spellStart"/>
-      <w:r>
-        <w:rPr>
-          <w:b/>
-          <w:bCs/>
-        </w:rPr>
-        <w:t>output_schema</w:t>
-      </w:r>
-      <w:proofErr w:type="spellEnd"/>
-      <w:r>
-        <w:rPr>
-          <w:b/>
-          <w:bCs/>
-        </w:rPr>
-        <w:t>). Esta información debe ser utilizada por el planeador para:\n"</w:t>
-      </w:r>
-    </w:p>
-    <w:p>
-      <w:pPr>
-        <w:rPr>
-          <w:b/>
-          <w:bCs/>
-        </w:rPr>
-      </w:pPr>
-      <w:r>
-        <w:rPr>
-          <w:b/>
-          <w:bCs/>
-        </w:rPr>
-        <w:t xml:space="preserve">            "- determinar qué herramientas son funcionalmente adecuadas para cada </w:t>
-      </w:r>
-      <w:proofErr w:type="gramStart"/>
-      <w:r>
-        <w:rPr>
-          <w:b/>
-          <w:bCs/>
-        </w:rPr>
-        <w:t>solicitud,\</w:t>
-      </w:r>
-      <w:proofErr w:type="gramEnd"/>
-      <w:r>
-        <w:rPr>
-          <w:b/>
-          <w:bCs/>
-        </w:rPr>
-        <w:t>n"</w:t>
-      </w:r>
-    </w:p>
-    <w:p>
-      <w:pPr>
-        <w:rPr>
-          <w:b/>
-          <w:bCs/>
-        </w:rPr>
-      </w:pPr>
-      <w:r>
-        <w:rPr>
-          <w:b/>
-          <w:bCs/>
-        </w:rPr>
-        <w:t xml:space="preserve">            "- construir cadenas de acciones donde la salida de una herramienta pueda servir como entrada de </w:t>
-      </w:r>
-      <w:proofErr w:type="gramStart"/>
-      <w:r>
-        <w:rPr>
-          <w:b/>
-          <w:bCs/>
-        </w:rPr>
-        <w:t>otra,\</w:t>
-      </w:r>
-      <w:proofErr w:type="gramEnd"/>
-      <w:r>
-        <w:rPr>
-          <w:b/>
-          <w:bCs/>
-        </w:rPr>
-        <w:t>n"</w:t>
-      </w:r>
-    </w:p>
-    <w:p>
-      <w:pPr>
-        <w:rPr>
-          <w:b/>
-          <w:bCs/>
-        </w:rPr>
-      </w:pPr>
-      <w:r>
-        <w:rPr>
-          <w:b/>
-          <w:bCs/>
-        </w:rPr>
-        <w:t>            "- y evaluar la viabilidad de un plan antes de su ejecución."</w:t>
+        <w:t>        "Contexto temporal del sistema, utilizado como referencia para interpretar "</w:t>
+      </w:r>
+    </w:p>
+    <w:p>
+      <w:pPr>
+        <w:rPr>
+          <w:b/>
+          <w:bCs/>
+        </w:rPr>
+      </w:pPr>
+      <w:r>
+        <w:rPr>
+          <w:b/>
+          <w:bCs/>
+        </w:rPr>
+        <w:t>        "expresiones temporales relativas presentes en las solicitudes del usuario. "</w:t>
+      </w:r>
+    </w:p>
+    <w:p>
+      <w:pPr>
+        <w:rPr>
+          <w:b/>
+          <w:bCs/>
+        </w:rPr>
+      </w:pPr>
+      <w:r>
+        <w:rPr>
+          <w:b/>
+          <w:bCs/>
+        </w:rPr>
+        <w:t>        "Incluye una fecha y hora de referencia, la zona horaria y rangos horarios "</w:t>
+      </w:r>
+    </w:p>
+    <w:p>
+      <w:pPr>
+        <w:rPr>
+          <w:b/>
+          <w:bCs/>
+        </w:rPr>
+      </w:pPr>
+      <w:r>
+        <w:rPr>
+          <w:b/>
+          <w:bCs/>
+        </w:rPr>
+        <w:t>        "predefinidos asociados a términos comunes."</w:t>
       </w:r>
     </w:p>
     <w:p>
@@ -1151,7 +1341,7 @@
           <w:b/>
           <w:bCs/>
         </w:rPr>
-        <w:t xml:space="preserve">        </w:t>
+        <w:t xml:space="preserve">    </w:t>
       </w:r>
       <w:r>
         <w:rPr>
@@ -1176,7 +1366,7 @@
           <w:bCs/>
           <w:lang w:val="en-US"/>
         </w:rPr>
-        <w:t>    )</w:t>
+        <w:t>)</w:t>
       </w:r>
     </w:p>
     <w:p>
@@ -1187,12 +1377,21 @@
           <w:lang w:val="en-US"/>
         </w:rPr>
       </w:pPr>
-      <w:r>
+    </w:p>
+    <w:p>
+      <w:pPr>
         <w:rPr>
           <w:b/>
           <w:bCs/>
           <w:lang w:val="en-US"/>
         </w:rPr>
+      </w:pPr>
+      <w:r>
+        <w:rPr>
+          <w:b/>
+          <w:bCs/>
+          <w:lang w:val="en-US"/>
+        </w:rPr>
         <w:t xml:space="preserve">    </w:t>
       </w:r>
       <w:proofErr w:type="spellStart"/>
@@ -1202,7 +1401,7 @@
           <w:bCs/>
           <w:lang w:val="en-US"/>
         </w:rPr>
-        <w:t>temporal_context</w:t>
+        <w:t>plan_acciones</w:t>
       </w:r>
       <w:proofErr w:type="spellEnd"/>
       <w:r>
@@ -1211,242 +1410,7 @@
           <w:bCs/>
           <w:lang w:val="en-US"/>
         </w:rPr>
-        <w:t xml:space="preserve">: </w:t>
-      </w:r>
-      <w:proofErr w:type="spellStart"/>
-      <w:r>
-        <w:rPr>
-          <w:b/>
-          <w:bCs/>
-          <w:lang w:val="en-US"/>
-        </w:rPr>
-        <w:t>dict</w:t>
-      </w:r>
-      <w:proofErr w:type="spellEnd"/>
-      <w:r>
-        <w:rPr>
-          <w:b/>
-          <w:bCs/>
-          <w:lang w:val="en-US"/>
-        </w:rPr>
-        <w:t xml:space="preserve"> = </w:t>
-      </w:r>
-      <w:proofErr w:type="spellStart"/>
-      <w:proofErr w:type="gramStart"/>
-      <w:r>
-        <w:rPr>
-          <w:b/>
-          <w:bCs/>
-          <w:lang w:val="en-US"/>
-        </w:rPr>
-        <w:t>dspy.InputField</w:t>
-      </w:r>
-      <w:proofErr w:type="spellEnd"/>
-      <w:proofErr w:type="gramEnd"/>
-      <w:r>
-        <w:rPr>
-          <w:b/>
-          <w:bCs/>
-          <w:lang w:val="en-US"/>
-        </w:rPr>
-        <w:t>(</w:t>
-      </w:r>
-    </w:p>
-    <w:p>
-      <w:pPr>
-        <w:rPr>
-          <w:b/>
-          <w:bCs/>
-        </w:rPr>
-      </w:pPr>
-      <w:r>
-        <w:rPr>
-          <w:b/>
-          <w:bCs/>
-          <w:lang w:val="en-US"/>
-        </w:rPr>
-        <w:t xml:space="preserve">    </w:t>
-      </w:r>
-      <w:proofErr w:type="spellStart"/>
-      <w:r>
-        <w:rPr>
-          <w:b/>
-          <w:bCs/>
-        </w:rPr>
-        <w:t>desc</w:t>
-      </w:r>
-      <w:proofErr w:type="spellEnd"/>
-      <w:proofErr w:type="gramStart"/>
-      <w:r>
-        <w:rPr>
-          <w:b/>
-          <w:bCs/>
-        </w:rPr>
-        <w:t>=(</w:t>
-      </w:r>
-      <w:proofErr w:type="gramEnd"/>
-    </w:p>
-    <w:p>
-      <w:pPr>
-        <w:rPr>
-          <w:b/>
-          <w:bCs/>
-        </w:rPr>
-      </w:pPr>
-      <w:r>
-        <w:rPr>
-          <w:b/>
-          <w:bCs/>
-        </w:rPr>
-        <w:t>        "Contexto temporal del sistema, utilizado como referencia para interpretar "</w:t>
-      </w:r>
-    </w:p>
-    <w:p>
-      <w:pPr>
-        <w:rPr>
-          <w:b/>
-          <w:bCs/>
-        </w:rPr>
-      </w:pPr>
-      <w:r>
-        <w:rPr>
-          <w:b/>
-          <w:bCs/>
-        </w:rPr>
-        <w:t>        "expresiones temporales relativas presentes en las solicitudes del usuario. "</w:t>
-      </w:r>
-    </w:p>
-    <w:p>
-      <w:pPr>
-        <w:rPr>
-          <w:b/>
-          <w:bCs/>
-        </w:rPr>
-      </w:pPr>
-      <w:r>
-        <w:rPr>
-          <w:b/>
-          <w:bCs/>
-        </w:rPr>
-        <w:t>        "Incluye una fecha y hora de referencia, la zona horaria y rangos horarios "</w:t>
-      </w:r>
-    </w:p>
-    <w:p>
-      <w:pPr>
-        <w:rPr>
-          <w:b/>
-          <w:bCs/>
-        </w:rPr>
-      </w:pPr>
-      <w:r>
-        <w:rPr>
-          <w:b/>
-          <w:bCs/>
-        </w:rPr>
-        <w:t>        "predefinidos asociados a términos comunes."</w:t>
-      </w:r>
-    </w:p>
-    <w:p>
-      <w:pPr>
-        <w:rPr>
-          <w:b/>
-          <w:bCs/>
-          <w:lang w:val="en-US"/>
-        </w:rPr>
-      </w:pPr>
-      <w:r>
-        <w:rPr>
-          <w:b/>
-          <w:bCs/>
-        </w:rPr>
-        <w:t xml:space="preserve">    </w:t>
-      </w:r>
-      <w:r>
-        <w:rPr>
-          <w:b/>
-          <w:bCs/>
-          <w:lang w:val="en-US"/>
-        </w:rPr>
-        <w:t>)</w:t>
-      </w:r>
-    </w:p>
-    <w:p>
-      <w:pPr>
-        <w:rPr>
-          <w:b/>
-          <w:bCs/>
-          <w:lang w:val="en-US"/>
-        </w:rPr>
-      </w:pPr>
-      <w:r>
-        <w:rPr>
-          <w:b/>
-          <w:bCs/>
-          <w:lang w:val="en-US"/>
-        </w:rPr>
-        <w:t>)</w:t>
-      </w:r>
-    </w:p>
-    <w:p>
-      <w:pPr>
-        <w:rPr>
-          <w:b/>
-          <w:bCs/>
-          <w:lang w:val="en-US"/>
-        </w:rPr>
-      </w:pPr>
-    </w:p>
-    <w:p>
-      <w:pPr>
-        <w:rPr>
-          <w:b/>
-          <w:bCs/>
-          <w:lang w:val="en-US"/>
-        </w:rPr>
-      </w:pPr>
-      <w:r>
-        <w:rPr>
-          <w:b/>
-          <w:bCs/>
-          <w:lang w:val="en-US"/>
-        </w:rPr>
-        <w:t xml:space="preserve">    </w:t>
-      </w:r>
-      <w:proofErr w:type="spellStart"/>
-      <w:r>
-        <w:rPr>
-          <w:b/>
-          <w:bCs/>
-          <w:lang w:val="en-US"/>
-        </w:rPr>
-        <w:t>plan_acciones</w:t>
-      </w:r>
-      <w:proofErr w:type="spellEnd"/>
-      <w:r>
-        <w:rPr>
-          <w:b/>
-          <w:bCs/>
-          <w:lang w:val="en-US"/>
-        </w:rPr>
-        <w:t>: list[</w:t>
-      </w:r>
-      <w:proofErr w:type="spellStart"/>
-      <w:r>
-        <w:rPr>
-          <w:b/>
-          <w:bCs/>
-          <w:lang w:val="en-US"/>
-        </w:rPr>
-        <w:t>dict</w:t>
-      </w:r>
-      <w:proofErr w:type="spellEnd"/>
-      <w:r>
-        <w:rPr>
-          <w:b/>
-          <w:bCs/>
-          <w:lang w:val="en-US"/>
-        </w:rPr>
-        <w:t xml:space="preserve">] = </w:t>
+        <w:t xml:space="preserve">: list[dict] = </w:t>
       </w:r>
       <w:proofErr w:type="spellStart"/>
       <w:proofErr w:type="gramStart"/>
@@ -10532,19 +10496,66 @@
     </w:p>
     <w:p>
       <w:r>
-        <w:t>[{'id': '</w:t>
-      </w:r>
-      <w:r>
-        <w:rPr>
-          <w:highlight w:val="darkMagenta"/>
-        </w:rPr>
-        <w:t>@1.1</w:t>
-      </w:r>
+        <w:t>[{'id': '@1.1', '</w:t>
+      </w:r>
+      <w:proofErr w:type="spellStart"/>
+      <w:r>
+        <w:t>server_id</w:t>
+      </w:r>
+      <w:proofErr w:type="spellEnd"/>
+      <w:r>
+        <w:t>': '</w:t>
+      </w:r>
+      <w:proofErr w:type="spellStart"/>
+      <w:r>
+        <w:t>mcp_server_gravity</w:t>
+      </w:r>
+      <w:proofErr w:type="spellEnd"/>
       <w:r>
         <w:t>', '</w:t>
       </w:r>
       <w:proofErr w:type="spellStart"/>
       <w:r>
+        <w:t>tool</w:t>
+      </w:r>
+      <w:proofErr w:type="spellEnd"/>
+      <w:r>
+        <w:t>': '</w:t>
+      </w:r>
+      <w:proofErr w:type="spellStart"/>
+      <w:r>
+        <w:t>obtener_consumo</w:t>
+      </w:r>
+      <w:proofErr w:type="spellEnd"/>
+      <w:r>
+        <w:t>', 'inputs': {'dispositivos': ['nevera'], '</w:t>
+      </w:r>
+      <w:proofErr w:type="spellStart"/>
+      <w:r>
+        <w:t>fecha_inicio</w:t>
+      </w:r>
+      <w:proofErr w:type="spellEnd"/>
+      <w:r>
+        <w:t>': '2024-11-14T18:00', '</w:t>
+      </w:r>
+      <w:proofErr w:type="spellStart"/>
+      <w:r>
+        <w:t>fecha_fin</w:t>
+      </w:r>
+      <w:proofErr w:type="spellEnd"/>
+      <w:r>
+        <w:t>': '2024-11-14T23:59', 'granularidad': 'total'}, '</w:t>
+      </w:r>
+      <w:proofErr w:type="spellStart"/>
+      <w:r>
+        <w:t>descripcion</w:t>
+      </w:r>
+      <w:proofErr w:type="spellEnd"/>
+      <w:r>
+        <w:t>': 'Obtener consumo de la nevera durante la noche de ayer (2024-11-14)'}, {'id': '@2.1', '</w:t>
+      </w:r>
+      <w:proofErr w:type="spellStart"/>
+      <w:r>
         <w:t>server_id</w:t>
       </w:r>
       <w:proofErr w:type="spellEnd"/>
@@ -10565,492 +10576,235 @@
       </w:r>
       <w:proofErr w:type="spellEnd"/>
       <w:r>
+        <w:t>': '</w:t>
+      </w:r>
+      <w:proofErr w:type="spellStart"/>
+      <w:r>
+        <w:t>obtener_consumo</w:t>
+      </w:r>
+      <w:proofErr w:type="spellEnd"/>
+      <w:r>
+        <w:t>', 'inputs': {'dispositivos': ['lavadora'], '</w:t>
+      </w:r>
+      <w:proofErr w:type="spellStart"/>
+      <w:r>
+        <w:t>fecha_inicio</w:t>
+      </w:r>
+      <w:proofErr w:type="spellEnd"/>
+      <w:r>
+        <w:t>': '2024-11-09T06:00', '</w:t>
+      </w:r>
+      <w:proofErr w:type="spellStart"/>
+      <w:r>
+        <w:t>fecha_fin</w:t>
+      </w:r>
+      <w:proofErr w:type="spellEnd"/>
+      <w:r>
+        <w:t>': '2024-11-09T11:59', 'granularidad': 'total'}, '</w:t>
+      </w:r>
+      <w:proofErr w:type="spellStart"/>
+      <w:r>
+        <w:t>descripcion</w:t>
+      </w:r>
+      <w:proofErr w:type="spellEnd"/>
+      <w:r>
+        <w:t>': 'Obtener consumo de la lavadora durante la mañana del sábado pasado (2024-11-09)'}, {'id': '@3.1', '</w:t>
+      </w:r>
+      <w:proofErr w:type="spellStart"/>
+      <w:r>
+        <w:t>server_id</w:t>
+      </w:r>
+      <w:proofErr w:type="spellEnd"/>
+      <w:r>
+        <w:t>': '</w:t>
+      </w:r>
+      <w:proofErr w:type="spellStart"/>
+      <w:r>
+        <w:t>mcp_server_gravity</w:t>
+      </w:r>
+      <w:proofErr w:type="spellEnd"/>
+      <w:r>
+        <w:t>', '</w:t>
+      </w:r>
+      <w:proofErr w:type="spellStart"/>
+      <w:r>
+        <w:t>tool</w:t>
+      </w:r>
+      <w:proofErr w:type="spellEnd"/>
+      <w:r>
+        <w:t>': '</w:t>
+      </w:r>
+      <w:proofErr w:type="spellStart"/>
+      <w:r>
+        <w:t>obtener_consumo</w:t>
+      </w:r>
+      <w:proofErr w:type="spellEnd"/>
+      <w:r>
+        <w:t>', 'inputs': {'dispositivos': ['nevera'], '</w:t>
+      </w:r>
+      <w:proofErr w:type="spellStart"/>
+      <w:r>
+        <w:t>fecha_inicio</w:t>
+      </w:r>
+      <w:proofErr w:type="spellEnd"/>
+      <w:r>
+        <w:t>': '2024-11-14T00:00', '</w:t>
+      </w:r>
+      <w:proofErr w:type="spellStart"/>
+      <w:r>
+        <w:t>fecha_fin</w:t>
+      </w:r>
+      <w:proofErr w:type="spellEnd"/>
+      <w:r>
+        <w:t>': '2024-11-14T23:59', 'granularidad': 'total'}, '</w:t>
+      </w:r>
+      <w:proofErr w:type="spellStart"/>
+      <w:r>
+        <w:t>descripcion</w:t>
+      </w:r>
+      <w:proofErr w:type="spellEnd"/>
+      <w:r>
+        <w:t>': 'Obtener consumo diario de la nevera para comparación (periodo supuesto 2024-11-14)'}, {'id': '@3.2', '</w:t>
+      </w:r>
+      <w:proofErr w:type="spellStart"/>
+      <w:r>
+        <w:t>server_id</w:t>
+      </w:r>
+      <w:proofErr w:type="spellEnd"/>
+      <w:r>
+        <w:t>': '</w:t>
+      </w:r>
+      <w:proofErr w:type="spellStart"/>
+      <w:r>
+        <w:t>mcp_server_gravity</w:t>
+      </w:r>
+      <w:proofErr w:type="spellEnd"/>
+      <w:r>
+        <w:t>', '</w:t>
+      </w:r>
+      <w:proofErr w:type="spellStart"/>
+      <w:r>
+        <w:t>tool</w:t>
+      </w:r>
+      <w:proofErr w:type="spellEnd"/>
+      <w:r>
+        <w:t>': '</w:t>
+      </w:r>
+      <w:proofErr w:type="spellStart"/>
+      <w:r>
+        <w:t>obtener_consumo</w:t>
+      </w:r>
+      <w:proofErr w:type="spellEnd"/>
+      <w:r>
+        <w:t>', 'inputs': {'dispositivos': ['lavadora'], '</w:t>
+      </w:r>
+      <w:proofErr w:type="spellStart"/>
+      <w:r>
+        <w:t>fecha_inicio</w:t>
+      </w:r>
+      <w:proofErr w:type="spellEnd"/>
+      <w:r>
+        <w:t>': '2024-11-14T00:00', '</w:t>
+      </w:r>
+      <w:proofErr w:type="spellStart"/>
+      <w:r>
+        <w:t>fecha_fin</w:t>
+      </w:r>
+      <w:proofErr w:type="spellEnd"/>
+      <w:r>
+        <w:t>': '2024-11-14T23:59', 'granularidad': 'total'}, '</w:t>
+      </w:r>
+      <w:proofErr w:type="spellStart"/>
+      <w:r>
+        <w:t>descripcion</w:t>
+      </w:r>
+      <w:proofErr w:type="spellEnd"/>
+      <w:r>
+        <w:t>': 'Obtener consumo diario de la lavadora para comparación (periodo supuesto 2024-11-14)'}, {'id': '@3.3', '</w:t>
+      </w:r>
+      <w:proofErr w:type="spellStart"/>
+      <w:r>
+        <w:t>server_id</w:t>
+      </w:r>
+      <w:proofErr w:type="spellEnd"/>
+      <w:r>
+        <w:t>': '</w:t>
+      </w:r>
+      <w:proofErr w:type="spellStart"/>
+      <w:r>
+        <w:t>mcp_server_gravity</w:t>
+      </w:r>
+      <w:proofErr w:type="spellEnd"/>
+      <w:r>
+        <w:t>', '</w:t>
+      </w:r>
+      <w:proofErr w:type="spellStart"/>
+      <w:r>
+        <w:t>tool</w:t>
+      </w:r>
+      <w:proofErr w:type="spellEnd"/>
+      <w:r>
+        <w:t>': '</w:t>
+      </w:r>
+      <w:proofErr w:type="spellStart"/>
+      <w:r>
+        <w:t>analizar_comparacion</w:t>
+      </w:r>
+      <w:proofErr w:type="spellEnd"/>
+      <w:r>
+        <w:t>', 'inputs': {'</w:t>
+      </w:r>
+      <w:proofErr w:type="spellStart"/>
+      <w:r>
+        <w:t>objetivo_a</w:t>
+      </w:r>
+      <w:proofErr w:type="spellEnd"/>
+      <w:r>
+        <w:t>': {'dispositivo': 'nevera', '</w:t>
+      </w:r>
+      <w:proofErr w:type="spellStart"/>
+      <w:r>
+        <w:t>fecha_inicio</w:t>
+      </w:r>
+      <w:proofErr w:type="spellEnd"/>
+      <w:r>
         <w:t xml:space="preserve">': </w:t>
       </w:r>
       <w:r>
-        <w:rPr>
-          <w:highlight w:val="yellow"/>
-        </w:rPr>
-        <w:t>'</w:t>
-      </w:r>
-      <w:proofErr w:type="spellStart"/>
-      <w:r>
-        <w:rPr>
-          <w:highlight w:val="yellow"/>
-        </w:rPr>
-        <w:t>obtener_consumo</w:t>
-      </w:r>
-      <w:proofErr w:type="spellEnd"/>
-      <w:r>
-        <w:rPr>
-          <w:highlight w:val="yellow"/>
-        </w:rPr>
-        <w:t>'</w:t>
-      </w:r>
-      <w:r>
-        <w:t xml:space="preserve">, 'inputs': {'dispositivos': </w:t>
-      </w:r>
-      <w:r>
-        <w:rPr>
-          <w:highlight w:val="yellow"/>
-        </w:rPr>
-        <w:t>['nevera'], '</w:t>
-      </w:r>
-      <w:proofErr w:type="spellStart"/>
-      <w:r>
-        <w:rPr>
-          <w:highlight w:val="yellow"/>
-        </w:rPr>
-        <w:t>fecha_inicio</w:t>
-      </w:r>
-      <w:proofErr w:type="spellEnd"/>
-      <w:r>
-        <w:rPr>
-          <w:highlight w:val="yellow"/>
-        </w:rPr>
-        <w:t>': '2024-11-14T18:00', '</w:t>
-      </w:r>
-      <w:proofErr w:type="spellStart"/>
-      <w:r>
-        <w:rPr>
-          <w:highlight w:val="yellow"/>
-        </w:rPr>
-        <w:t>fecha_fin</w:t>
-      </w:r>
-      <w:proofErr w:type="spellEnd"/>
-      <w:r>
-        <w:rPr>
-          <w:highlight w:val="yellow"/>
-        </w:rPr>
-        <w:t>': '2024-11</w:t>
-      </w:r>
-      <w:r>
-        <w:t>-14T23:59', 'granularidad': 'total'}, '</w:t>
-      </w:r>
-      <w:proofErr w:type="spellStart"/>
-      <w:r>
-        <w:t>descripcion</w:t>
-      </w:r>
-      <w:proofErr w:type="spellEnd"/>
-      <w:r>
-        <w:t>': 'Obtener consumo de la nevera durante la noche de ayer (2024-11-14)'}, {'id': '@2.1', '</w:t>
-      </w:r>
-      <w:proofErr w:type="spellStart"/>
-      <w:r>
-        <w:t>server_id</w:t>
-      </w:r>
-      <w:proofErr w:type="spellEnd"/>
-      <w:r>
-        <w:t>': '</w:t>
-      </w:r>
-      <w:proofErr w:type="spellStart"/>
-      <w:r>
-        <w:t>mcp_server_gravity</w:t>
-      </w:r>
-      <w:proofErr w:type="spellEnd"/>
-      <w:r>
-        <w:t>', '</w:t>
-      </w:r>
-      <w:proofErr w:type="spellStart"/>
-      <w:r>
-        <w:t>tool</w:t>
-      </w:r>
-      <w:proofErr w:type="spellEnd"/>
-      <w:r>
-        <w:t xml:space="preserve">': </w:t>
-      </w:r>
-      <w:r>
-        <w:rPr>
-          <w:highlight w:val="green"/>
-        </w:rPr>
-        <w:t>'</w:t>
-      </w:r>
-      <w:proofErr w:type="spellStart"/>
-      <w:r>
-        <w:rPr>
-          <w:highlight w:val="green"/>
-        </w:rPr>
-        <w:t>obtener_consumo</w:t>
-      </w:r>
-      <w:proofErr w:type="spellEnd"/>
-      <w:r>
-        <w:t xml:space="preserve">', 'inputs': {'dispositivos': </w:t>
-      </w:r>
-      <w:r>
-        <w:rPr>
-          <w:highlight w:val="green"/>
-        </w:rPr>
-        <w:t>['lavadora'], '</w:t>
-      </w:r>
-      <w:proofErr w:type="spellStart"/>
-      <w:r>
-        <w:rPr>
-          <w:highlight w:val="green"/>
-        </w:rPr>
-        <w:t>fecha_inicio</w:t>
-      </w:r>
-      <w:proofErr w:type="spellEnd"/>
-      <w:r>
-        <w:rPr>
-          <w:highlight w:val="green"/>
-        </w:rPr>
-        <w:t>': '2024-11-09T06:00', '</w:t>
-      </w:r>
-      <w:proofErr w:type="spellStart"/>
-      <w:r>
-        <w:rPr>
-          <w:highlight w:val="green"/>
-        </w:rPr>
-        <w:t>fecha_fin</w:t>
-      </w:r>
-      <w:proofErr w:type="spellEnd"/>
-      <w:r>
-        <w:rPr>
-          <w:highlight w:val="green"/>
-        </w:rPr>
-        <w:t>': '2024-11-09T11:59'</w:t>
-      </w:r>
-      <w:r>
-        <w:t>, 'granularidad': 'total'}, '</w:t>
-      </w:r>
-      <w:proofErr w:type="spellStart"/>
-      <w:r>
-        <w:t>descripcion</w:t>
-      </w:r>
-      <w:proofErr w:type="spellEnd"/>
-      <w:r>
-        <w:t>': 'Obtener consumo de la lavadora durante la mañana del sábado pasado (2024-11-09)'}, {'id': '@3.1', '</w:t>
-      </w:r>
-      <w:proofErr w:type="spellStart"/>
-      <w:r>
-        <w:t>server_id</w:t>
-      </w:r>
-      <w:proofErr w:type="spellEnd"/>
-      <w:r>
-        <w:t>': '</w:t>
-      </w:r>
-      <w:proofErr w:type="spellStart"/>
-      <w:r>
-        <w:t>mcp_server_gravity</w:t>
-      </w:r>
-      <w:proofErr w:type="spellEnd"/>
-      <w:r>
-        <w:t>', '</w:t>
-      </w:r>
-      <w:proofErr w:type="spellStart"/>
-      <w:r>
-        <w:t>tool</w:t>
-      </w:r>
-      <w:proofErr w:type="spellEnd"/>
-      <w:r>
-        <w:t xml:space="preserve">': </w:t>
-      </w:r>
-      <w:r>
-        <w:rPr>
-          <w:highlight w:val="cyan"/>
-        </w:rPr>
-        <w:t>'</w:t>
-      </w:r>
-      <w:proofErr w:type="spellStart"/>
-      <w:r>
-        <w:rPr>
-          <w:highlight w:val="cyan"/>
-        </w:rPr>
-        <w:t>obtener_consumo</w:t>
-      </w:r>
-      <w:proofErr w:type="spellEnd"/>
-      <w:r>
-        <w:rPr>
-          <w:highlight w:val="cyan"/>
-        </w:rPr>
-        <w:t>'</w:t>
-      </w:r>
-      <w:r>
-        <w:t>, 'inputs': {</w:t>
-      </w:r>
-      <w:r>
-        <w:rPr>
-          <w:highlight w:val="cyan"/>
-        </w:rPr>
-        <w:t>'dispositivos': ['nevera'], '</w:t>
-      </w:r>
-      <w:proofErr w:type="spellStart"/>
-      <w:r>
-        <w:rPr>
-          <w:highlight w:val="cyan"/>
-        </w:rPr>
-        <w:t>fecha_inicio</w:t>
-      </w:r>
-      <w:proofErr w:type="spellEnd"/>
-      <w:r>
-        <w:rPr>
-          <w:highlight w:val="cyan"/>
-        </w:rPr>
-        <w:t>': '2024-11-14T00:00', '</w:t>
-      </w:r>
-      <w:proofErr w:type="spellStart"/>
-      <w:r>
-        <w:rPr>
-          <w:highlight w:val="cyan"/>
-        </w:rPr>
-        <w:t>fecha_fin</w:t>
-      </w:r>
-      <w:proofErr w:type="spellEnd"/>
-      <w:r>
-        <w:rPr>
-          <w:highlight w:val="cyan"/>
-        </w:rPr>
-        <w:t>': '2024-11-14T23:59'</w:t>
-      </w:r>
-      <w:r>
-        <w:t>, 'granularidad': 'total'}, '</w:t>
-      </w:r>
-      <w:proofErr w:type="spellStart"/>
-      <w:r>
-        <w:t>descripcion</w:t>
-      </w:r>
-      <w:proofErr w:type="spellEnd"/>
-      <w:r>
-        <w:t>': 'Obtener consumo diario de la nevera para comparación (periodo supuesto 2024-11-14)'}, {'id': '@3.2', '</w:t>
-      </w:r>
-      <w:proofErr w:type="spellStart"/>
-      <w:r>
-        <w:t>server_id</w:t>
-      </w:r>
-      <w:proofErr w:type="spellEnd"/>
-      <w:r>
-        <w:t>': '</w:t>
-      </w:r>
-      <w:proofErr w:type="spellStart"/>
-      <w:r>
-        <w:t>mcp_server_gravity</w:t>
-      </w:r>
-      <w:proofErr w:type="spellEnd"/>
-      <w:r>
-        <w:t>', '</w:t>
-      </w:r>
-      <w:proofErr w:type="spellStart"/>
-      <w:r>
-        <w:t>tool</w:t>
-      </w:r>
-      <w:proofErr w:type="spellEnd"/>
-      <w:r>
-        <w:t xml:space="preserve">': </w:t>
-      </w:r>
-      <w:r>
-        <w:rPr>
-          <w:highlight w:val="magenta"/>
-        </w:rPr>
-        <w:t>'</w:t>
-      </w:r>
-      <w:proofErr w:type="spellStart"/>
-      <w:r>
-        <w:rPr>
-          <w:highlight w:val="magenta"/>
-        </w:rPr>
-        <w:t>obtener_consumo</w:t>
-      </w:r>
-      <w:proofErr w:type="spellEnd"/>
-      <w:r>
-        <w:rPr>
-          <w:highlight w:val="magenta"/>
-        </w:rPr>
-        <w:t>'</w:t>
-      </w:r>
-      <w:r>
-        <w:t>, 'inputs': {</w:t>
-      </w:r>
-      <w:r>
-        <w:rPr>
-          <w:highlight w:val="magenta"/>
-        </w:rPr>
-        <w:t>'dispositivos': ['lavadora'], '</w:t>
-      </w:r>
-      <w:proofErr w:type="spellStart"/>
-      <w:r>
-        <w:rPr>
-          <w:highlight w:val="magenta"/>
-        </w:rPr>
-        <w:t>fecha_inicio</w:t>
-      </w:r>
-      <w:proofErr w:type="spellEnd"/>
-      <w:r>
-        <w:rPr>
-          <w:highlight w:val="magenta"/>
-        </w:rPr>
-        <w:t>': '2024-11-14T00:00', '</w:t>
-      </w:r>
-      <w:proofErr w:type="spellStart"/>
-      <w:r>
-        <w:rPr>
-          <w:highlight w:val="magenta"/>
-        </w:rPr>
-        <w:t>fecha_fin</w:t>
-      </w:r>
-      <w:proofErr w:type="spellEnd"/>
-      <w:r>
-        <w:rPr>
-          <w:highlight w:val="magenta"/>
-        </w:rPr>
-        <w:t>': '2024-11-14T23:59'</w:t>
-      </w:r>
-      <w:r>
-        <w:t>, 'granularidad': 'total'}, '</w:t>
-      </w:r>
-      <w:proofErr w:type="spellStart"/>
-      <w:r>
-        <w:t>descripcion</w:t>
-      </w:r>
-      <w:proofErr w:type="spellEnd"/>
-      <w:r>
-        <w:t>': 'Obtener consumo diario de la lavadora para comparación (periodo supuesto 2024-11-14)'}, {'id': '@3.3', '</w:t>
-      </w:r>
-      <w:proofErr w:type="spellStart"/>
-      <w:r>
-        <w:t>server_id</w:t>
-      </w:r>
-      <w:proofErr w:type="spellEnd"/>
-      <w:r>
-        <w:t>': '</w:t>
-      </w:r>
-      <w:proofErr w:type="spellStart"/>
-      <w:r>
-        <w:t>mcp_server_gravity</w:t>
-      </w:r>
-      <w:proofErr w:type="spellEnd"/>
-      <w:r>
-        <w:t>', '</w:t>
-      </w:r>
-      <w:proofErr w:type="spellStart"/>
-      <w:r>
-        <w:t>tool</w:t>
-      </w:r>
-      <w:proofErr w:type="spellEnd"/>
-      <w:r>
-        <w:t xml:space="preserve">': </w:t>
-      </w:r>
-      <w:r>
-        <w:rPr>
-          <w:highlight w:val="red"/>
-        </w:rPr>
-        <w:t>'</w:t>
-      </w:r>
-      <w:proofErr w:type="spellStart"/>
-      <w:r>
-        <w:rPr>
-          <w:highlight w:val="red"/>
-        </w:rPr>
-        <w:t>analizar_comparacion</w:t>
-      </w:r>
-      <w:proofErr w:type="spellEnd"/>
-      <w:r>
-        <w:rPr>
-          <w:highlight w:val="red"/>
-        </w:rPr>
-        <w:t>', 'inputs': {'</w:t>
-      </w:r>
-      <w:proofErr w:type="spellStart"/>
-      <w:r>
-        <w:rPr>
-          <w:highlight w:val="red"/>
-        </w:rPr>
-        <w:t>objetivo_a</w:t>
-      </w:r>
-      <w:proofErr w:type="spellEnd"/>
-      <w:r>
-        <w:rPr>
-          <w:highlight w:val="red"/>
-        </w:rPr>
-        <w:t>': {'dispositivo': 'nevera', '</w:t>
-      </w:r>
-      <w:proofErr w:type="spellStart"/>
-      <w:r>
-        <w:rPr>
-          <w:highlight w:val="red"/>
-        </w:rPr>
-        <w:t>fecha_inicio</w:t>
-      </w:r>
-      <w:proofErr w:type="spellEnd"/>
-      <w:r>
-        <w:rPr>
-          <w:highlight w:val="red"/>
-        </w:rPr>
-        <w:t xml:space="preserve">': </w:t>
-      </w:r>
-      <w:r>
-        <w:rPr>
-          <w:highlight w:val="red"/>
-        </w:rPr>
         <w:lastRenderedPageBreak/>
         <w:t>'2024-11-14T00:00', '</w:t>
       </w:r>
       <w:proofErr w:type="spellStart"/>
       <w:r>
-        <w:rPr>
-          <w:highlight w:val="red"/>
-        </w:rPr>
-        <w:t>fecha_fin</w:t>
-      </w:r>
-      <w:proofErr w:type="spellEnd"/>
-      <w:r>
-        <w:rPr>
-          <w:highlight w:val="red"/>
-        </w:rPr>
-        <w:t>': '2024-11-14T23:59'</w:t>
-      </w:r>
-      <w:r>
-        <w:t xml:space="preserve">}, </w:t>
-      </w:r>
-      <w:r>
-        <w:rPr>
-          <w:highlight w:val="red"/>
-        </w:rPr>
-        <w:t>'</w:t>
-      </w:r>
-      <w:proofErr w:type="spellStart"/>
-      <w:r>
-        <w:rPr>
-          <w:highlight w:val="red"/>
-        </w:rPr>
+        <w:t>fecha_fin</w:t>
+      </w:r>
+      <w:proofErr w:type="spellEnd"/>
+      <w:r>
+        <w:t>': '2024-11-14T23:59'}, '</w:t>
+      </w:r>
+      <w:proofErr w:type="spellStart"/>
+      <w:r>
         <w:t>objetivo_b</w:t>
       </w:r>
       <w:proofErr w:type="spellEnd"/>
       <w:r>
-        <w:rPr>
-          <w:highlight w:val="red"/>
-        </w:rPr>
         <w:t>': {'dispositivo': 'lavadora', '</w:t>
       </w:r>
       <w:proofErr w:type="spellStart"/>
       <w:r>
-        <w:rPr>
-          <w:highlight w:val="red"/>
-        </w:rPr>
         <w:t>fecha_inicio</w:t>
       </w:r>
       <w:proofErr w:type="spellEnd"/>
       <w:r>
-        <w:rPr>
-          <w:highlight w:val="red"/>
-        </w:rPr>
         <w:t>': '2024-11-14T00:00', '</w:t>
       </w:r>
       <w:proofErr w:type="spellStart"/>
       <w:r>
-        <w:rPr>
-          <w:highlight w:val="red"/>
-        </w:rPr>
-        <w:t>fecha_fin</w:t>
-      </w:r>
-      <w:proofErr w:type="spellEnd"/>
-      <w:r>
-        <w:rPr>
-          <w:highlight w:val="red"/>
-        </w:rPr>
-        <w:t>': '2024-11-14T23:59'}},</w:t>
-      </w:r>
-      <w:r>
-        <w:t xml:space="preserve"> '</w:t>
+        <w:t>fecha_fin</w:t>
+      </w:r>
+      <w:proofErr w:type="spellEnd"/>
+      <w:r>
+        <w:t>': '2024-11-14T23:59'}}, '</w:t>
       </w:r>
       <w:proofErr w:type="spellStart"/>
       <w:r>
@@ -11082,81 +10836,39 @@
       </w:r>
       <w:proofErr w:type="spellEnd"/>
       <w:r>
-        <w:t xml:space="preserve">': </w:t>
-      </w:r>
-      <w:r>
-        <w:rPr>
-          <w:highlight w:val="darkMagenta"/>
-        </w:rPr>
-        <w:t>'</w:t>
-      </w:r>
-      <w:proofErr w:type="spellStart"/>
-      <w:r>
-        <w:rPr>
-          <w:highlight w:val="darkMagenta"/>
-        </w:rPr>
+        <w:t>': '</w:t>
+      </w:r>
+      <w:proofErr w:type="spellStart"/>
+      <w:r>
         <w:t>obtener_consumo</w:t>
       </w:r>
       <w:proofErr w:type="spellEnd"/>
       <w:r>
-        <w:rPr>
-          <w:highlight w:val="darkMagenta"/>
-        </w:rPr>
-        <w:t>',</w:t>
-      </w:r>
-      <w:r>
-        <w:t xml:space="preserve"> 'inputs': {'</w:t>
-      </w:r>
-      <w:r>
-        <w:rPr>
-          <w:highlight w:val="darkMagenta"/>
-        </w:rPr>
-        <w:t>dispositivos': ['</w:t>
-      </w:r>
-      <w:proofErr w:type="spellStart"/>
-      <w:r>
-        <w:rPr>
-          <w:highlight w:val="darkMagenta"/>
-        </w:rPr>
+        <w:t>', 'inputs': {'dispositivos': ['</w:t>
+      </w:r>
+      <w:proofErr w:type="spellStart"/>
+      <w:r>
         <w:t>Total_Casa</w:t>
       </w:r>
       <w:proofErr w:type="spellEnd"/>
       <w:r>
-        <w:rPr>
-          <w:highlight w:val="darkMagenta"/>
-        </w:rPr>
         <w:t>'], '</w:t>
       </w:r>
       <w:proofErr w:type="spellStart"/>
       <w:r>
-        <w:rPr>
-          <w:highlight w:val="darkMagenta"/>
-        </w:rPr>
         <w:t>fecha_inicio</w:t>
       </w:r>
       <w:proofErr w:type="spellEnd"/>
       <w:r>
-        <w:rPr>
-          <w:highlight w:val="darkMagenta"/>
-        </w:rPr>
         <w:t>': '2024-01-01T00:00', '</w:t>
       </w:r>
       <w:proofErr w:type="spellStart"/>
       <w:r>
-        <w:rPr>
-          <w:highlight w:val="darkMagenta"/>
-        </w:rPr>
-        <w:t>fecha_fin</w:t>
-      </w:r>
-      <w:proofErr w:type="spellEnd"/>
-      <w:r>
-        <w:rPr>
-          <w:highlight w:val="darkMagenta"/>
-        </w:rPr>
-        <w:t>': '2024-12-31T23:59'</w:t>
-      </w:r>
-      <w:r>
-        <w:t>, 'granularidad': 'mes'}, '</w:t>
+        <w:t>fecha_fin</w:t>
+      </w:r>
+      <w:proofErr w:type="spellEnd"/>
+      <w:r>
+        <w:t>': '2024-12-31T23:59', 'granularidad': 'mes'}, '</w:t>
       </w:r>
       <w:proofErr w:type="spellStart"/>
       <w:r>
@@ -11785,19 +11497,9 @@
         <w:pStyle w:val="Ttulo3"/>
       </w:pPr>
       <w:r>
-        <w:lastRenderedPageBreak/>
         <w:t>Análisis</w:t>
       </w:r>
     </w:p>
-    <w:p/>
-    <w:p/>
-    <w:p/>
-    <w:p/>
-    <w:p/>
-    <w:p/>
-    <w:p/>
-    <w:p/>
-    <w:p/>
     <w:sectPr>
       <w:pgSz w:w="12240" w:h="15840"/>
       <w:pgMar w:top="1417" w:right="1701" w:bottom="1417" w:left="1701" w:header="720" w:footer="720" w:gutter="0"/>

</xml_diff>